<commit_message>
dbt seems to work properly now
</commit_message>
<xml_diff>
--- a/Notes 001 Ansh Lamba DBT Training.docx
+++ b/Notes 001 Ansh Lamba DBT Training.docx
@@ -33,31 +33,7 @@
     <w:p/>
     <w:p>
       <w:r>
-        <w:t xml:space="preserve">Create a </w:t>
-      </w:r>
-      <w:proofErr w:type="spellStart"/>
-      <w:r>
-        <w:t>conda</w:t>
-      </w:r>
-      <w:proofErr w:type="spellEnd"/>
-      <w:r>
-        <w:t xml:space="preserve"> environment and install </w:t>
-      </w:r>
-      <w:proofErr w:type="spellStart"/>
-      <w:r>
-        <w:t>dbt</w:t>
-      </w:r>
-      <w:proofErr w:type="spellEnd"/>
-      <w:r>
-        <w:t xml:space="preserve"> into it (using a </w:t>
-      </w:r>
-      <w:proofErr w:type="spellStart"/>
-      <w:r>
-        <w:t>yml</w:t>
-      </w:r>
-      <w:proofErr w:type="spellEnd"/>
-      <w:r>
-        <w:t xml:space="preserve"> file, see: </w:t>
+        <w:t xml:space="preserve">Create a conda environment and install dbt into it (using a yml file, see: </w:t>
       </w:r>
       <w:r>
         <w:t>dbt_databricks_env001.yml</w:t>
@@ -68,20 +44,166 @@
     </w:p>
     <w:p>
       <w:r>
-        <w:t>To set up “scaffold” of a data science project in a working folder, run command inside the folder:</w:t>
+        <w:t xml:space="preserve"> </w:t>
       </w:r>
     </w:p>
     <w:p>
-      <w:proofErr w:type="spellStart"/>
       <w:r>
-        <w:t>ccds</w:t>
+        <w:t xml:space="preserve">Repository: </w:t>
       </w:r>
-      <w:proofErr w:type="spellEnd"/>
+      <w:hyperlink r:id="rId5" w:history="1">
+        <w:r>
+          <w:rPr>
+            <w:rStyle w:val="Hyperlink"/>
+          </w:rPr>
+          <w:t>https://github.com/anshlambagit/AnshLambaYoutube</w:t>
+        </w:r>
+      </w:hyperlink>
+    </w:p>
+    <w:p>
+      <w:hyperlink r:id="rId6" w:history="1">
+        <w:r>
+          <w:rPr>
+            <w:rStyle w:val="Hyperlink"/>
+          </w:rPr>
+          <w:t>https://github.com/anshlambagit/AnshLambaYoutube/tree/main/DBT_Masterclass</w:t>
+        </w:r>
+      </w:hyperlink>
+    </w:p>
+    <w:p>
       <w:r>
-        <w:t xml:space="preserve"> </w:t>
+        <w:t>First commands:</w:t>
+      </w:r>
+    </w:p>
+    <w:p>
+      <w:r>
+        <w:rPr>
+          <w:noProof/>
+        </w:rPr>
+        <w:drawing>
+          <wp:inline distT="0" distB="0" distL="0" distR="0" wp14:anchorId="562166A1" wp14:editId="7BAD0710">
+            <wp:extent cx="6858000" cy="3535680"/>
+            <wp:effectExtent l="0" t="0" r="0" b="7620"/>
+            <wp:docPr id="941806492" name="Picture 1" descr="A screenshot of a computer program&#10;&#10;AI-generated content may be incorrect."/>
+            <wp:cNvGraphicFramePr>
+              <a:graphicFrameLocks xmlns:a="http://schemas.openxmlformats.org/drawingml/2006/main" noChangeAspect="1"/>
+            </wp:cNvGraphicFramePr>
+            <a:graphic xmlns:a="http://schemas.openxmlformats.org/drawingml/2006/main">
+              <a:graphicData uri="http://schemas.openxmlformats.org/drawingml/2006/picture">
+                <pic:pic xmlns:pic="http://schemas.openxmlformats.org/drawingml/2006/picture">
+                  <pic:nvPicPr>
+                    <pic:cNvPr id="941806492" name="Picture 1" descr="A screenshot of a computer program&#10;&#10;AI-generated content may be incorrect."/>
+                    <pic:cNvPicPr/>
+                  </pic:nvPicPr>
+                  <pic:blipFill>
+                    <a:blip r:embed="rId7"/>
+                    <a:stretch>
+                      <a:fillRect/>
+                    </a:stretch>
+                  </pic:blipFill>
+                  <pic:spPr>
+                    <a:xfrm>
+                      <a:off x="0" y="0"/>
+                      <a:ext cx="6858000" cy="3535680"/>
+                    </a:xfrm>
+                    <a:prstGeom prst="rect">
+                      <a:avLst/>
+                    </a:prstGeom>
+                  </pic:spPr>
+                </pic:pic>
+              </a:graphicData>
+            </a:graphic>
+          </wp:inline>
+        </w:drawing>
       </w:r>
     </w:p>
     <w:p/>
+    <w:p>
+      <w:r>
+        <w:rPr>
+          <w:noProof/>
+        </w:rPr>
+        <w:lastRenderedPageBreak/>
+        <w:drawing>
+          <wp:inline distT="0" distB="0" distL="0" distR="0" wp14:anchorId="77D3564D" wp14:editId="1B818BA5">
+            <wp:extent cx="6858000" cy="2952115"/>
+            <wp:effectExtent l="0" t="0" r="0" b="635"/>
+            <wp:docPr id="1692285433" name="Picture 1" descr="A computer screen shot of text&#10;&#10;AI-generated content may be incorrect."/>
+            <wp:cNvGraphicFramePr>
+              <a:graphicFrameLocks xmlns:a="http://schemas.openxmlformats.org/drawingml/2006/main" noChangeAspect="1"/>
+            </wp:cNvGraphicFramePr>
+            <a:graphic xmlns:a="http://schemas.openxmlformats.org/drawingml/2006/main">
+              <a:graphicData uri="http://schemas.openxmlformats.org/drawingml/2006/picture">
+                <pic:pic xmlns:pic="http://schemas.openxmlformats.org/drawingml/2006/picture">
+                  <pic:nvPicPr>
+                    <pic:cNvPr id="1692285433" name="Picture 1" descr="A computer screen shot of text&#10;&#10;AI-generated content may be incorrect."/>
+                    <pic:cNvPicPr/>
+                  </pic:nvPicPr>
+                  <pic:blipFill>
+                    <a:blip r:embed="rId8"/>
+                    <a:stretch>
+                      <a:fillRect/>
+                    </a:stretch>
+                  </pic:blipFill>
+                  <pic:spPr>
+                    <a:xfrm>
+                      <a:off x="0" y="0"/>
+                      <a:ext cx="6858000" cy="2952115"/>
+                    </a:xfrm>
+                    <a:prstGeom prst="rect">
+                      <a:avLst/>
+                    </a:prstGeom>
+                  </pic:spPr>
+                </pic:pic>
+              </a:graphicData>
+            </a:graphic>
+          </wp:inline>
+        </w:drawing>
+      </w:r>
+    </w:p>
+    <w:p/>
+    <w:p>
+      <w:r>
+        <w:rPr>
+          <w:noProof/>
+        </w:rPr>
+        <w:drawing>
+          <wp:inline distT="0" distB="0" distL="0" distR="0" wp14:anchorId="2326BE50" wp14:editId="4E3EF9A9">
+            <wp:extent cx="6858000" cy="2731770"/>
+            <wp:effectExtent l="0" t="0" r="0" b="0"/>
+            <wp:docPr id="381850382" name="Picture 1" descr="A computer screen shot of text&#10;&#10;AI-generated content may be incorrect."/>
+            <wp:cNvGraphicFramePr>
+              <a:graphicFrameLocks xmlns:a="http://schemas.openxmlformats.org/drawingml/2006/main" noChangeAspect="1"/>
+            </wp:cNvGraphicFramePr>
+            <a:graphic xmlns:a="http://schemas.openxmlformats.org/drawingml/2006/main">
+              <a:graphicData uri="http://schemas.openxmlformats.org/drawingml/2006/picture">
+                <pic:pic xmlns:pic="http://schemas.openxmlformats.org/drawingml/2006/picture">
+                  <pic:nvPicPr>
+                    <pic:cNvPr id="381850382" name="Picture 1" descr="A computer screen shot of text&#10;&#10;AI-generated content may be incorrect."/>
+                    <pic:cNvPicPr/>
+                  </pic:nvPicPr>
+                  <pic:blipFill>
+                    <a:blip r:embed="rId9"/>
+                    <a:stretch>
+                      <a:fillRect/>
+                    </a:stretch>
+                  </pic:blipFill>
+                  <pic:spPr>
+                    <a:xfrm>
+                      <a:off x="0" y="0"/>
+                      <a:ext cx="6858000" cy="2731770"/>
+                    </a:xfrm>
+                    <a:prstGeom prst="rect">
+                      <a:avLst/>
+                    </a:prstGeom>
+                  </pic:spPr>
+                </pic:pic>
+              </a:graphicData>
+            </a:graphic>
+          </wp:inline>
+        </w:drawing>
+      </w:r>
+    </w:p>
     <w:sectPr>
       <w:pgSz w:w="12240" w:h="15840"/>
       <w:pgMar w:top="720" w:right="720" w:bottom="720" w:left="720" w:header="720" w:footer="720" w:gutter="0"/>

</xml_diff>